<commit_message>
Renumber: Benchmark to Issue 002 (March), Telemetry Trap to 003 (April) - chronological by analysis date. Pattern-by-Pattern headline now Eight AI Adoption Patterns Scored. Date of Analysis March 8 2026 added to landing card. Papers index reordered newest first. PDF and DOCX regenerated.
</commit_message>
<xml_diff>
--- a/docs/the-ai-deployment-pattern-benchmark-grove-white-paper.docx
+++ b/docs/the-ai-deployment-pattern-benchmark-grove-white-paper.docx
@@ -28,6 +28,12 @@
     <w:p/>
     <w:p>
       <w:r>
+        <w:t xml:space="preserve">**Date of Analysis: March 8, 2026**</w:t>
+      </w:r>
+    </w:p>
+    <w:p/>
+    <w:p>
+      <w:r>
         <w:t xml:space="preserve">---</w:t>
       </w:r>
     </w:p>
@@ -356,7 +362,7 @@
         <w:pStyle w:val="Heading2"/>
       </w:pPr>
       <w:r>
-        <w:t>Pattern-by-pattern</w:t>
+        <w:t>Eight AI Adoption Patterns Scored</w:t>
       </w:r>
     </w:p>
     <w:p/>
@@ -788,7 +794,7 @@
     <w:p/>
     <w:p>
       <w:r>
-        <w:t xml:space="preserve">CC BY 4.0 · March 2026 · Issue 003</w:t>
+        <w:t xml:space="preserve">CC BY 4.0 · March 2026 · Issue 002</w:t>
       </w:r>
     </w:p>
     <w:p/>

</xml_diff>